<commit_message>
docs: usa primera persona en CV de Evershine
</commit_message>
<xml_diff>
--- a/boveda-entrevista-profesional/busqueda-empleo/candidaturas/CAND-2026-001-evershine-investments-administrativo/cv.docx
+++ b/boveda-entrevista-profesional/busqueda-empleo/candidaturas/CAND-2026-001-evershine-investments-administrativo/cv.docx
@@ -248,7 +248,9 @@
           <w:color w:val="000000"/>
           <w:sz w:val="21"/>
         </w:rPr>
-        <w:t>Clasificó datos y documentos laborales, separó información personal y profesional y adaptó los accesos a necesidades administrativas y de protección de datos.</w:t>
+      </w:r>
+      <w:r>
+        <w:t>Clasifiqué datos y documentos laborales, separé información personal y profesional y adapté los accesos a necesidades administrativas y de protección de datos.</w:t>
       </w:r>
     </w:p>
     <w:p>
@@ -268,7 +270,9 @@
           <w:color w:val="000000"/>
           <w:sz w:val="21"/>
         </w:rPr>
-        <w:t>Automatizó documentación de contratación y onboarding: una preparación que requería unos 20 minutos pasó a generarse de forma inmediata desde información estructurada.</w:t>
+      </w:r>
+      <w:r>
+        <w:t>Automaticé documentación de contratación y onboarding: una preparación que requería unos 20 minutos pasó a generarse de forma inmediata desde información estructurada.</w:t>
       </w:r>
     </w:p>
     <w:p>
@@ -288,7 +292,9 @@
           <w:color w:val="000000"/>
           <w:sz w:val="21"/>
         </w:rPr>
-        <w:t>Implantó el registro y la calendarización de solicitudes de días libres, permisos y vacaciones; el personal pasó a recibir información en horas en vez de días.</w:t>
+      </w:r>
+      <w:r>
+        <w:t>Implanté el registro y la calendarización de solicitudes de días libres, permisos y vacaciones; el personal pasó a recibir información en horas en vez de días.</w:t>
       </w:r>
     </w:p>
     <w:p>
@@ -308,7 +314,9 @@
           <w:color w:val="000000"/>
           <w:sz w:val="21"/>
         </w:rPr>
-        <w:t>Diseñó flujos con programación propia, Trello y Notion para candidaturas, incorporación, documentación y seguimiento; las decisiones de contratación correspondían al Consejo de Dirección.</w:t>
+      </w:r>
+      <w:r>
+        <w:t>Diseñé flujos con programación propia, Trello y Notion para candidaturas, incorporación, documentación y seguimiento; las decisiones de contratación correspondían al Consejo de Dirección.</w:t>
       </w:r>
     </w:p>
     <w:p>
@@ -348,7 +356,9 @@
           <w:color w:val="000000"/>
           <w:sz w:val="21"/>
         </w:rPr>
-        <w:t>Diseñó bases de datos para solicitudes de vivienda pública y clasificó información de baremación.</w:t>
+      </w:r>
+      <w:r>
+        <w:t>Diseñé bases de datos para solicitudes de vivienda pública y clasifiqué información de baremación.</w:t>
       </w:r>
     </w:p>
     <w:p>
@@ -368,7 +378,9 @@
           <w:color w:val="000000"/>
           <w:sz w:val="21"/>
         </w:rPr>
-        <w:t>Generó documentación oficial asociada a cada paso de las solicitudes y programas de apoyo para personal funcionario, dentro de un equipo y bajo asignación del responsable.</w:t>
+      </w:r>
+      <w:r>
+        <w:t>Generé documentación oficial asociada a cada paso de las solicitudes y programas de apoyo para personal funcionario, dentro de un equipo y bajo asignación del responsable.</w:t>
       </w:r>
     </w:p>
     <w:p>
@@ -418,7 +430,9 @@
           <w:color w:val="000000"/>
           <w:sz w:val="21"/>
         </w:rPr>
-        <w:t>Usó hojas de cálculo para analizar presupuestos y acelerar la disponibilidad de información de Tesorería e Intervención para el grupo de gobierno.</w:t>
+      </w:r>
+      <w:r>
+        <w:t>Usé hojas de cálculo para analizar presupuestos y acelerar la disponibilidad de información de Tesorería e Intervención para el grupo de gobierno.</w:t>
       </w:r>
     </w:p>
     <w:p>
@@ -438,7 +452,9 @@
           <w:color w:val="000000"/>
           <w:sz w:val="21"/>
         </w:rPr>
-        <w:t>Automatizó el cálculo de plusvalías y dejó las solicitudes impresas y preparadas para cobro al día siguiente.</w:t>
+      </w:r>
+      <w:r>
+        <w:t>Automaticé el cálculo de plusvalías y dejé las solicitudes impresas y preparadas para cobro al día siguiente.</w:t>
       </w:r>
     </w:p>
     <w:p>
@@ -458,7 +474,9 @@
           <w:color w:val="000000"/>
           <w:sz w:val="21"/>
         </w:rPr>
-        <w:t>Informatizó el proceso de apremio: aumentó un 120 % el número de notificaciones y un 60 % el importe recaudado, además de facilitar fraccionamientos de deuda.</w:t>
+      </w:r>
+      <w:r>
+        <w:t>Informaticé el proceso de apremio: aumenté un 120 % el número de notificaciones y un 60 % el importe recaudado, además de facilitar fraccionamientos de deuda.</w:t>
       </w:r>
     </w:p>
     <w:p>
@@ -498,7 +516,9 @@
           <w:color w:val="000000"/>
           <w:sz w:val="21"/>
         </w:rPr>
-        <w:t>Analizó y mejoró software de gestión comercial y contabilidad de acuerdo con las necesidades del negocio.</w:t>
+      </w:r>
+      <w:r>
+        <w:t>Analicé y mejoré software de gestión comercial y contabilidad de acuerdo con las necesidades del negocio.</w:t>
       </w:r>
     </w:p>
     <w:p>

</xml_diff>

<commit_message>
feat: consolida Job-up y renombra skill de inicio
</commit_message>
<xml_diff>
--- a/boveda-entrevista-profesional/busqueda-empleo/candidaturas/CAND-2026-001-evershine-investments-administrativo/cv.docx
+++ b/boveda-entrevista-profesional/busqueda-empleo/candidaturas/CAND-2026-001-evershine-investments-administrativo/cv.docx
@@ -6,8 +6,57 @@
       <w:pPr>
         <w:pStyle w:val="Normal"/>
         <w:spacing w:before="0" w:after="40"/>
+        <w:jc w:val="center"/>
         <w:rPr/>
       </w:pPr>
+      <w:r>
+        <w:drawing>
+          <wp:anchor behindDoc="0" distT="0" distB="0" distL="0" distR="0" simplePos="0" locked="0" layoutInCell="1" allowOverlap="1" relativeHeight="2">
+            <wp:simplePos x="0" y="0"/>
+            <wp:positionH relativeFrom="column">
+              <wp:posOffset>-153035</wp:posOffset>
+            </wp:positionH>
+            <wp:positionV relativeFrom="paragraph">
+              <wp:posOffset>-591820</wp:posOffset>
+            </wp:positionV>
+            <wp:extent cx="956945" cy="956945"/>
+            <wp:effectExtent l="0" t="0" r="0" b="0"/>
+            <wp:wrapNone/>
+            <wp:docPr id="1" name="Imagen1"/>
+            <wp:cNvGraphicFramePr>
+              <a:graphicFrameLocks xmlns:a="http://schemas.openxmlformats.org/drawingml/2006/main" noChangeAspect="1"/>
+            </wp:cNvGraphicFramePr>
+            <a:graphic xmlns:a="http://schemas.openxmlformats.org/drawingml/2006/main">
+              <a:graphicData uri="http://schemas.openxmlformats.org/drawingml/2006/picture">
+                <pic:pic xmlns:pic="http://schemas.openxmlformats.org/drawingml/2006/picture">
+                  <pic:nvPicPr>
+                    <pic:cNvPr id="1" name="Imagen1"/>
+                    <pic:cNvPicPr>
+                      <a:picLocks noChangeAspect="1" noChangeArrowheads="1"/>
+                    </pic:cNvPicPr>
+                  </pic:nvPicPr>
+                  <pic:blipFill>
+                    <a:blip r:embed="rId2"/>
+                    <a:stretch>
+                      <a:fillRect/>
+                    </a:stretch>
+                  </pic:blipFill>
+                  <pic:spPr bwMode="auto">
+                    <a:xfrm>
+                      <a:off x="0" y="0"/>
+                      <a:ext cx="956945" cy="956945"/>
+                    </a:xfrm>
+                    <a:prstGeom prst="rect">
+                      <a:avLst/>
+                    </a:prstGeom>
+                    <a:noFill/>
+                  </pic:spPr>
+                </pic:pic>
+              </a:graphicData>
+            </a:graphic>
+          </wp:anchor>
+        </w:drawing>
+      </w:r>
       <w:r>
         <w:rPr>
           <w:b/>
@@ -22,6 +71,7 @@
       <w:pPr>
         <w:pStyle w:val="Normal"/>
         <w:spacing w:before="0" w:after="160"/>
+        <w:jc w:val="center"/>
         <w:rPr/>
       </w:pPr>
       <w:r>
@@ -38,6 +88,7 @@
       <w:pPr>
         <w:pStyle w:val="Normal"/>
         <w:spacing w:before="0" w:after="280"/>
+        <w:jc w:val="center"/>
         <w:rPr/>
       </w:pPr>
       <w:r>
@@ -242,14 +293,7 @@
         <w:rPr/>
       </w:pPr>
       <w:r>
-        <w:rPr>
-          <w:b w:val="false"/>
-          <w:i w:val="false"/>
-          <w:color w:val="000000"/>
-          <w:sz w:val="21"/>
-        </w:rPr>
-      </w:r>
-      <w:r>
+        <w:rPr/>
         <w:t>Clasifiqué datos y documentos laborales, separé información personal y profesional y adapté los accesos a necesidades administrativas y de protección de datos.</w:t>
       </w:r>
     </w:p>
@@ -264,14 +308,7 @@
         <w:rPr/>
       </w:pPr>
       <w:r>
-        <w:rPr>
-          <w:b w:val="false"/>
-          <w:i w:val="false"/>
-          <w:color w:val="000000"/>
-          <w:sz w:val="21"/>
-        </w:rPr>
-      </w:r>
-      <w:r>
+        <w:rPr/>
         <w:t>Automaticé documentación de contratación y onboarding: una preparación que requería unos 20 minutos pasó a generarse de forma inmediata desde información estructurada.</w:t>
       </w:r>
     </w:p>
@@ -286,14 +323,7 @@
         <w:rPr/>
       </w:pPr>
       <w:r>
-        <w:rPr>
-          <w:b w:val="false"/>
-          <w:i w:val="false"/>
-          <w:color w:val="000000"/>
-          <w:sz w:val="21"/>
-        </w:rPr>
-      </w:r>
-      <w:r>
+        <w:rPr/>
         <w:t>Implanté el registro y la calendarización de solicitudes de días libres, permisos y vacaciones; el personal pasó a recibir información en horas en vez de días.</w:t>
       </w:r>
     </w:p>
@@ -308,14 +338,7 @@
         <w:rPr/>
       </w:pPr>
       <w:r>
-        <w:rPr>
-          <w:b w:val="false"/>
-          <w:i w:val="false"/>
-          <w:color w:val="000000"/>
-          <w:sz w:val="21"/>
-        </w:rPr>
-      </w:r>
-      <w:r>
+        <w:rPr/>
         <w:t>Diseñé flujos con programación propia, Trello y Notion para candidaturas, incorporación, documentación y seguimiento; las decisiones de contratación correspondían al Consejo de Dirección.</w:t>
       </w:r>
     </w:p>
@@ -350,14 +373,7 @@
         <w:rPr/>
       </w:pPr>
       <w:r>
-        <w:rPr>
-          <w:b w:val="false"/>
-          <w:i w:val="false"/>
-          <w:color w:val="000000"/>
-          <w:sz w:val="21"/>
-        </w:rPr>
-      </w:r>
-      <w:r>
+        <w:rPr/>
         <w:t>Diseñé bases de datos para solicitudes de vivienda pública y clasifiqué información de baremación.</w:t>
       </w:r>
     </w:p>
@@ -372,14 +388,7 @@
         <w:rPr/>
       </w:pPr>
       <w:r>
-        <w:rPr>
-          <w:b w:val="false"/>
-          <w:i w:val="false"/>
-          <w:color w:val="000000"/>
-          <w:sz w:val="21"/>
-        </w:rPr>
-      </w:r>
-      <w:r>
+        <w:rPr/>
         <w:t>Generé documentación oficial asociada a cada paso de las solicitudes y programas de apoyo para personal funcionario, dentro de un equipo y bajo asignación del responsable.</w:t>
       </w:r>
     </w:p>
@@ -424,14 +433,7 @@
         <w:rPr/>
       </w:pPr>
       <w:r>
-        <w:rPr>
-          <w:b w:val="false"/>
-          <w:i w:val="false"/>
-          <w:color w:val="000000"/>
-          <w:sz w:val="21"/>
-        </w:rPr>
-      </w:r>
-      <w:r>
+        <w:rPr/>
         <w:t>Usé hojas de cálculo para analizar presupuestos y acelerar la disponibilidad de información de Tesorería e Intervención para el grupo de gobierno.</w:t>
       </w:r>
     </w:p>
@@ -446,14 +448,7 @@
         <w:rPr/>
       </w:pPr>
       <w:r>
-        <w:rPr>
-          <w:b w:val="false"/>
-          <w:i w:val="false"/>
-          <w:color w:val="000000"/>
-          <w:sz w:val="21"/>
-        </w:rPr>
-      </w:r>
-      <w:r>
+        <w:rPr/>
         <w:t>Automaticé el cálculo de plusvalías y dejé las solicitudes impresas y preparadas para cobro al día siguiente.</w:t>
       </w:r>
     </w:p>
@@ -468,14 +463,7 @@
         <w:rPr/>
       </w:pPr>
       <w:r>
-        <w:rPr>
-          <w:b w:val="false"/>
-          <w:i w:val="false"/>
-          <w:color w:val="000000"/>
-          <w:sz w:val="21"/>
-        </w:rPr>
-      </w:r>
-      <w:r>
+        <w:rPr/>
         <w:t>Informaticé el proceso de apremio: aumenté un 120 % el número de notificaciones y un 60 % el importe recaudado, además de facilitar fraccionamientos de deuda.</w:t>
       </w:r>
     </w:p>
@@ -510,14 +498,7 @@
         <w:rPr/>
       </w:pPr>
       <w:r>
-        <w:rPr>
-          <w:b w:val="false"/>
-          <w:i w:val="false"/>
-          <w:color w:val="000000"/>
-          <w:sz w:val="21"/>
-        </w:rPr>
-      </w:r>
-      <w:r>
+        <w:rPr/>
         <w:t>Analicé y mejoré software de gestión comercial y contabilidad de acuerdo con las necesidades del negocio.</w:t>
       </w:r>
     </w:p>
@@ -709,9 +690,9 @@
       </w:r>
     </w:p>
     <w:sectPr>
-      <w:footerReference w:type="even" r:id="rId2"/>
-      <w:footerReference w:type="default" r:id="rId3"/>
-      <w:footerReference w:type="first" r:id="rId4"/>
+      <w:footerReference w:type="even" r:id="rId3"/>
+      <w:footerReference w:type="default" r:id="rId4"/>
+      <w:footerReference w:type="first" r:id="rId5"/>
       <w:type w:val="nextPage"/>
       <w:pgSz w:w="12240" w:h="15840"/>
       <w:pgMar w:left="1440" w:right="1440" w:gutter="0" w:header="0" w:top="1440" w:footer="708" w:bottom="1440"/>
@@ -790,7 +771,7 @@
         <w:color w:val="000000"/>
         <w:sz w:val="22"/>
       </w:rPr>
-      <w:t>2</w:t>
+      <w:t>3</w:t>
     </w:r>
     <w:r>
       <w:rPr>
@@ -844,7 +825,7 @@
         <w:color w:val="000000"/>
         <w:sz w:val="22"/>
       </w:rPr>
-      <w:t>2</w:t>
+      <w:t>3</w:t>
     </w:r>
     <w:r>
       <w:rPr>
@@ -911,7 +892,7 @@
         <w:color w:val="000000"/>
         <w:sz w:val="22"/>
       </w:rPr>
-      <w:t>2</w:t>
+      <w:t>3</w:t>
     </w:r>
     <w:r>
       <w:rPr>
@@ -965,7 +946,7 @@
         <w:color w:val="000000"/>
         <w:sz w:val="22"/>
       </w:rPr>
-      <w:t>2</w:t>
+      <w:t>3</w:t>
     </w:r>
     <w:r>
       <w:rPr>
@@ -1009,6 +990,7 @@
         </w:tabs>
         <w:ind w:start="1080" w:hanging="360"/>
       </w:pPr>
+      <w:rPr/>
     </w:lvl>
     <w:lvl w:ilvl="2">
       <w:start w:val="1"/>
@@ -1021,6 +1003,7 @@
         </w:tabs>
         <w:ind w:start="1440" w:hanging="360"/>
       </w:pPr>
+      <w:rPr/>
     </w:lvl>
     <w:lvl w:ilvl="3">
       <w:start w:val="1"/>
@@ -1033,6 +1016,7 @@
         </w:tabs>
         <w:ind w:start="1800" w:hanging="360"/>
       </w:pPr>
+      <w:rPr/>
     </w:lvl>
     <w:lvl w:ilvl="4">
       <w:start w:val="1"/>
@@ -1045,6 +1029,7 @@
         </w:tabs>
         <w:ind w:start="2160" w:hanging="360"/>
       </w:pPr>
+      <w:rPr/>
     </w:lvl>
     <w:lvl w:ilvl="5">
       <w:start w:val="1"/>
@@ -1057,6 +1042,7 @@
         </w:tabs>
         <w:ind w:start="2520" w:hanging="360"/>
       </w:pPr>
+      <w:rPr/>
     </w:lvl>
     <w:lvl w:ilvl="6">
       <w:start w:val="1"/>
@@ -1069,6 +1055,7 @@
         </w:tabs>
         <w:ind w:start="2880" w:hanging="360"/>
       </w:pPr>
+      <w:rPr/>
     </w:lvl>
     <w:lvl w:ilvl="7">
       <w:start w:val="1"/>
@@ -1081,6 +1068,7 @@
         </w:tabs>
         <w:ind w:start="3240" w:hanging="360"/>
       </w:pPr>
+      <w:rPr/>
     </w:lvl>
     <w:lvl w:ilvl="8">
       <w:start w:val="1"/>
@@ -1093,6 +1081,7 @@
         </w:tabs>
         <w:ind w:start="3600" w:hanging="360"/>
       </w:pPr>
+      <w:rPr/>
     </w:lvl>
   </w:abstractNum>
   <w:abstractNum w:abstractNumId="2">
@@ -1122,6 +1111,7 @@
         </w:tabs>
         <w:ind w:start="1080" w:hanging="360"/>
       </w:pPr>
+      <w:rPr/>
     </w:lvl>
     <w:lvl w:ilvl="2">
       <w:start w:val="1"/>
@@ -1134,6 +1124,7 @@
         </w:tabs>
         <w:ind w:start="1440" w:hanging="360"/>
       </w:pPr>
+      <w:rPr/>
     </w:lvl>
     <w:lvl w:ilvl="3">
       <w:start w:val="1"/>
@@ -1146,6 +1137,7 @@
         </w:tabs>
         <w:ind w:start="1800" w:hanging="360"/>
       </w:pPr>
+      <w:rPr/>
     </w:lvl>
     <w:lvl w:ilvl="4">
       <w:start w:val="1"/>
@@ -1158,6 +1150,7 @@
         </w:tabs>
         <w:ind w:start="2160" w:hanging="360"/>
       </w:pPr>
+      <w:rPr/>
     </w:lvl>
     <w:lvl w:ilvl="5">
       <w:start w:val="1"/>
@@ -1170,6 +1163,7 @@
         </w:tabs>
         <w:ind w:start="2520" w:hanging="360"/>
       </w:pPr>
+      <w:rPr/>
     </w:lvl>
     <w:lvl w:ilvl="6">
       <w:start w:val="1"/>
@@ -1182,6 +1176,7 @@
         </w:tabs>
         <w:ind w:start="2880" w:hanging="360"/>
       </w:pPr>
+      <w:rPr/>
     </w:lvl>
     <w:lvl w:ilvl="7">
       <w:start w:val="1"/>
@@ -1194,6 +1189,7 @@
         </w:tabs>
         <w:ind w:start="3240" w:hanging="360"/>
       </w:pPr>
+      <w:rPr/>
     </w:lvl>
     <w:lvl w:ilvl="8">
       <w:start w:val="1"/>
@@ -1206,6 +1202,7 @@
         </w:tabs>
         <w:ind w:start="3600" w:hanging="360"/>
       </w:pPr>
+      <w:rPr/>
     </w:lvl>
   </w:abstractNum>
   <w:abstractNum w:abstractNumId="3">
@@ -1235,6 +1232,7 @@
         </w:tabs>
         <w:ind w:start="1080" w:hanging="360"/>
       </w:pPr>
+      <w:rPr/>
     </w:lvl>
     <w:lvl w:ilvl="2">
       <w:start w:val="1"/>
@@ -1247,6 +1245,7 @@
         </w:tabs>
         <w:ind w:start="1440" w:hanging="360"/>
       </w:pPr>
+      <w:rPr/>
     </w:lvl>
     <w:lvl w:ilvl="3">
       <w:start w:val="1"/>
@@ -1259,6 +1258,7 @@
         </w:tabs>
         <w:ind w:start="1800" w:hanging="360"/>
       </w:pPr>
+      <w:rPr/>
     </w:lvl>
     <w:lvl w:ilvl="4">
       <w:start w:val="1"/>
@@ -1271,6 +1271,7 @@
         </w:tabs>
         <w:ind w:start="2160" w:hanging="360"/>
       </w:pPr>
+      <w:rPr/>
     </w:lvl>
     <w:lvl w:ilvl="5">
       <w:start w:val="1"/>
@@ -1283,6 +1284,7 @@
         </w:tabs>
         <w:ind w:start="2520" w:hanging="360"/>
       </w:pPr>
+      <w:rPr/>
     </w:lvl>
     <w:lvl w:ilvl="6">
       <w:start w:val="1"/>
@@ -1295,6 +1297,7 @@
         </w:tabs>
         <w:ind w:start="2880" w:hanging="360"/>
       </w:pPr>
+      <w:rPr/>
     </w:lvl>
     <w:lvl w:ilvl="7">
       <w:start w:val="1"/>
@@ -1307,6 +1310,7 @@
         </w:tabs>
         <w:ind w:start="3240" w:hanging="360"/>
       </w:pPr>
+      <w:rPr/>
     </w:lvl>
     <w:lvl w:ilvl="8">
       <w:start w:val="1"/>
@@ -1319,6 +1323,7 @@
         </w:tabs>
         <w:ind w:start="3600" w:hanging="360"/>
       </w:pPr>
+      <w:rPr/>
     </w:lvl>
   </w:abstractNum>
   <w:abstractNum w:abstractNumId="4">
@@ -1346,6 +1351,7 @@
         </w:tabs>
         <w:ind w:start="1080" w:hanging="360"/>
       </w:pPr>
+      <w:rPr/>
     </w:lvl>
     <w:lvl w:ilvl="2">
       <w:start w:val="1"/>
@@ -1358,6 +1364,7 @@
         </w:tabs>
         <w:ind w:start="1440" w:hanging="360"/>
       </w:pPr>
+      <w:rPr/>
     </w:lvl>
     <w:lvl w:ilvl="3">
       <w:start w:val="1"/>
@@ -1370,6 +1377,7 @@
         </w:tabs>
         <w:ind w:start="1800" w:hanging="360"/>
       </w:pPr>
+      <w:rPr/>
     </w:lvl>
     <w:lvl w:ilvl="4">
       <w:start w:val="1"/>
@@ -1382,6 +1390,7 @@
         </w:tabs>
         <w:ind w:start="2160" w:hanging="360"/>
       </w:pPr>
+      <w:rPr/>
     </w:lvl>
     <w:lvl w:ilvl="5">
       <w:start w:val="1"/>
@@ -1394,6 +1403,7 @@
         </w:tabs>
         <w:ind w:start="2520" w:hanging="360"/>
       </w:pPr>
+      <w:rPr/>
     </w:lvl>
     <w:lvl w:ilvl="6">
       <w:start w:val="1"/>
@@ -1406,6 +1416,7 @@
         </w:tabs>
         <w:ind w:start="2880" w:hanging="360"/>
       </w:pPr>
+      <w:rPr/>
     </w:lvl>
     <w:lvl w:ilvl="7">
       <w:start w:val="1"/>
@@ -1418,6 +1429,7 @@
         </w:tabs>
         <w:ind w:start="3240" w:hanging="360"/>
       </w:pPr>
+      <w:rPr/>
     </w:lvl>
     <w:lvl w:ilvl="8">
       <w:start w:val="1"/>
@@ -1430,6 +1442,7 @@
         </w:tabs>
         <w:ind w:start="3600" w:hanging="360"/>
       </w:pPr>
+      <w:rPr/>
     </w:lvl>
   </w:abstractNum>
   <w:abstractNum w:abstractNumId="5">
@@ -1457,6 +1470,7 @@
         </w:tabs>
         <w:ind w:start="1080" w:hanging="360"/>
       </w:pPr>
+      <w:rPr/>
     </w:lvl>
     <w:lvl w:ilvl="2">
       <w:start w:val="1"/>
@@ -1469,6 +1483,7 @@
         </w:tabs>
         <w:ind w:start="1440" w:hanging="360"/>
       </w:pPr>
+      <w:rPr/>
     </w:lvl>
     <w:lvl w:ilvl="3">
       <w:start w:val="1"/>
@@ -1481,6 +1496,7 @@
         </w:tabs>
         <w:ind w:start="1800" w:hanging="360"/>
       </w:pPr>
+      <w:rPr/>
     </w:lvl>
     <w:lvl w:ilvl="4">
       <w:start w:val="1"/>
@@ -1493,6 +1509,7 @@
         </w:tabs>
         <w:ind w:start="2160" w:hanging="360"/>
       </w:pPr>
+      <w:rPr/>
     </w:lvl>
     <w:lvl w:ilvl="5">
       <w:start w:val="1"/>
@@ -1505,6 +1522,7 @@
         </w:tabs>
         <w:ind w:start="2520" w:hanging="360"/>
       </w:pPr>
+      <w:rPr/>
     </w:lvl>
     <w:lvl w:ilvl="6">
       <w:start w:val="1"/>
@@ -1517,6 +1535,7 @@
         </w:tabs>
         <w:ind w:start="2880" w:hanging="360"/>
       </w:pPr>
+      <w:rPr/>
     </w:lvl>
     <w:lvl w:ilvl="7">
       <w:start w:val="1"/>
@@ -1529,6 +1548,7 @@
         </w:tabs>
         <w:ind w:start="3240" w:hanging="360"/>
       </w:pPr>
+      <w:rPr/>
     </w:lvl>
     <w:lvl w:ilvl="8">
       <w:start w:val="1"/>
@@ -1541,6 +1561,7 @@
         </w:tabs>
         <w:ind w:start="3600" w:hanging="360"/>
       </w:pPr>
+      <w:rPr/>
     </w:lvl>
   </w:abstractNum>
   <w:abstractNum w:abstractNumId="6">
@@ -1568,6 +1589,7 @@
         </w:tabs>
         <w:ind w:start="1080" w:hanging="360"/>
       </w:pPr>
+      <w:rPr/>
     </w:lvl>
     <w:lvl w:ilvl="2">
       <w:start w:val="1"/>
@@ -1580,6 +1602,7 @@
         </w:tabs>
         <w:ind w:start="1440" w:hanging="360"/>
       </w:pPr>
+      <w:rPr/>
     </w:lvl>
     <w:lvl w:ilvl="3">
       <w:start w:val="1"/>
@@ -1592,6 +1615,7 @@
         </w:tabs>
         <w:ind w:start="1800" w:hanging="360"/>
       </w:pPr>
+      <w:rPr/>
     </w:lvl>
     <w:lvl w:ilvl="4">
       <w:start w:val="1"/>
@@ -1604,6 +1628,7 @@
         </w:tabs>
         <w:ind w:start="2160" w:hanging="360"/>
       </w:pPr>
+      <w:rPr/>
     </w:lvl>
     <w:lvl w:ilvl="5">
       <w:start w:val="1"/>
@@ -1616,6 +1641,7 @@
         </w:tabs>
         <w:ind w:start="2520" w:hanging="360"/>
       </w:pPr>
+      <w:rPr/>
     </w:lvl>
     <w:lvl w:ilvl="6">
       <w:start w:val="1"/>
@@ -1628,6 +1654,7 @@
         </w:tabs>
         <w:ind w:start="2880" w:hanging="360"/>
       </w:pPr>
+      <w:rPr/>
     </w:lvl>
     <w:lvl w:ilvl="7">
       <w:start w:val="1"/>
@@ -1640,6 +1667,7 @@
         </w:tabs>
         <w:ind w:start="3240" w:hanging="360"/>
       </w:pPr>
+      <w:rPr/>
     </w:lvl>
     <w:lvl w:ilvl="8">
       <w:start w:val="1"/>
@@ -1652,6 +1680,7 @@
         </w:tabs>
         <w:ind w:start="3600" w:hanging="360"/>
       </w:pPr>
+      <w:rPr/>
     </w:lvl>
   </w:abstractNum>
   <w:abstractNum w:abstractNumId="7">
@@ -1681,6 +1710,7 @@
         </w:tabs>
         <w:ind w:start="1080" w:hanging="360"/>
       </w:pPr>
+      <w:rPr/>
     </w:lvl>
     <w:lvl w:ilvl="2">
       <w:start w:val="1"/>
@@ -1693,6 +1723,7 @@
         </w:tabs>
         <w:ind w:start="1440" w:hanging="360"/>
       </w:pPr>
+      <w:rPr/>
     </w:lvl>
     <w:lvl w:ilvl="3">
       <w:start w:val="1"/>
@@ -1705,6 +1736,7 @@
         </w:tabs>
         <w:ind w:start="1800" w:hanging="360"/>
       </w:pPr>
+      <w:rPr/>
     </w:lvl>
     <w:lvl w:ilvl="4">
       <w:start w:val="1"/>
@@ -1717,6 +1749,7 @@
         </w:tabs>
         <w:ind w:start="2160" w:hanging="360"/>
       </w:pPr>
+      <w:rPr/>
     </w:lvl>
     <w:lvl w:ilvl="5">
       <w:start w:val="1"/>
@@ -1729,6 +1762,7 @@
         </w:tabs>
         <w:ind w:start="2520" w:hanging="360"/>
       </w:pPr>
+      <w:rPr/>
     </w:lvl>
     <w:lvl w:ilvl="6">
       <w:start w:val="1"/>
@@ -1741,6 +1775,7 @@
         </w:tabs>
         <w:ind w:start="2880" w:hanging="360"/>
       </w:pPr>
+      <w:rPr/>
     </w:lvl>
     <w:lvl w:ilvl="7">
       <w:start w:val="1"/>
@@ -1753,6 +1788,7 @@
         </w:tabs>
         <w:ind w:start="3240" w:hanging="360"/>
       </w:pPr>
+      <w:rPr/>
     </w:lvl>
     <w:lvl w:ilvl="8">
       <w:start w:val="1"/>
@@ -1765,6 +1801,7 @@
         </w:tabs>
         <w:ind w:start="3600" w:hanging="360"/>
       </w:pPr>
+      <w:rPr/>
     </w:lvl>
   </w:abstractNum>
   <w:abstractNum w:abstractNumId="8">
@@ -1918,7 +1955,7 @@
   <w:docDefaults>
     <w:rPrDefault>
       <w:rPr>
-        <w:rFonts w:ascii="Cambria" w:hAnsi="Cambria" w:eastAsia="ＭＳ 明朝" w:cs="" w:asciiTheme="minorHAnsi" w:cstheme="minorBidi" w:eastAsiaTheme="minorEastAsia" w:hAnsiTheme="minorHAnsi"/>
+        <w:rFonts w:ascii="Cambria" w:hAnsi="Cambria" w:eastAsia="" w:cs="" w:asciiTheme="minorHAnsi" w:cstheme="minorBidi" w:eastAsiaTheme="minorEastAsia" w:hAnsiTheme="minorHAnsi"/>
         <w:sz w:val="22"/>
         <w:szCs w:val="22"/>
         <w:lang w:val="en-US" w:eastAsia="en-US" w:bidi="ar-SA"/>
@@ -2075,6 +2112,7 @@
     <w:rsid w:val="00fc693f"/>
     <w:pPr>
       <w:widowControl/>
+      <w:suppressAutoHyphens w:val="true"/>
       <w:bidi w:val="0"/>
       <w:spacing w:lineRule="auto" w:line="264" w:before="0" w:after="120"/>
       <w:jc w:val="both"/>
@@ -2104,7 +2142,7 @@
       <w:outlineLvl w:val="0"/>
     </w:pPr>
     <w:rPr>
-      <w:rFonts w:ascii="Calibri" w:hAnsi="Calibri" w:eastAsia="ＭＳ ゴシック" w:cs="" w:asciiTheme="majorHAnsi" w:cstheme="majorBidi" w:eastAsiaTheme="majorEastAsia" w:hAnsiTheme="majorHAnsi"/>
+      <w:rFonts w:ascii="Calibri" w:hAnsi="Calibri" w:eastAsia="" w:cs="" w:asciiTheme="majorHAnsi" w:cstheme="majorBidi" w:eastAsiaTheme="majorEastAsia" w:hAnsiTheme="majorHAnsi"/>
       <w:b/>
       <w:bCs/>
       <w:color w:val="2E74B5"/>
@@ -2128,7 +2166,7 @@
       <w:outlineLvl w:val="1"/>
     </w:pPr>
     <w:rPr>
-      <w:rFonts w:ascii="Calibri" w:hAnsi="Calibri" w:eastAsia="ＭＳ ゴシック" w:cs="" w:asciiTheme="majorHAnsi" w:cstheme="majorBidi" w:eastAsiaTheme="majorEastAsia" w:hAnsiTheme="majorHAnsi"/>
+      <w:rFonts w:ascii="Calibri" w:hAnsi="Calibri" w:eastAsia="" w:cs="" w:asciiTheme="majorHAnsi" w:cstheme="majorBidi" w:eastAsiaTheme="majorEastAsia" w:hAnsiTheme="majorHAnsi"/>
       <w:b/>
       <w:bCs/>
       <w:color w:val="2E74B5"/>
@@ -2152,7 +2190,7 @@
       <w:outlineLvl w:val="2"/>
     </w:pPr>
     <w:rPr>
-      <w:rFonts w:ascii="Calibri" w:hAnsi="Calibri" w:eastAsia="ＭＳ ゴシック" w:cs="" w:asciiTheme="majorHAnsi" w:cstheme="majorBidi" w:eastAsiaTheme="majorEastAsia" w:hAnsiTheme="majorHAnsi"/>
+      <w:rFonts w:ascii="Calibri" w:hAnsi="Calibri" w:eastAsia="" w:cs="" w:asciiTheme="majorHAnsi" w:cstheme="majorBidi" w:eastAsiaTheme="majorEastAsia" w:hAnsiTheme="majorHAnsi"/>
       <w:b/>
       <w:bCs/>
       <w:color w:val="1F4D78"/>
@@ -2176,7 +2214,7 @@
       <w:outlineLvl w:val="3"/>
     </w:pPr>
     <w:rPr>
-      <w:rFonts w:ascii="Calibri" w:hAnsi="Calibri" w:eastAsia="ＭＳ ゴシック" w:cs="" w:asciiTheme="majorHAnsi" w:cstheme="majorBidi" w:eastAsiaTheme="majorEastAsia" w:hAnsiTheme="majorHAnsi"/>
+      <w:rFonts w:ascii="Calibri" w:hAnsi="Calibri" w:eastAsia="" w:cs="" w:asciiTheme="majorHAnsi" w:cstheme="majorBidi" w:eastAsiaTheme="majorEastAsia" w:hAnsiTheme="majorHAnsi"/>
       <w:b/>
       <w:bCs/>
       <w:i/>
@@ -2201,7 +2239,7 @@
       <w:outlineLvl w:val="4"/>
     </w:pPr>
     <w:rPr>
-      <w:rFonts w:ascii="Calibri" w:hAnsi="Calibri" w:eastAsia="ＭＳ ゴシック" w:cs="" w:asciiTheme="majorHAnsi" w:cstheme="majorBidi" w:eastAsiaTheme="majorEastAsia" w:hAnsiTheme="majorHAnsi"/>
+      <w:rFonts w:ascii="Calibri" w:hAnsi="Calibri" w:eastAsia="" w:cs="" w:asciiTheme="majorHAnsi" w:cstheme="majorBidi" w:eastAsiaTheme="majorEastAsia" w:hAnsiTheme="majorHAnsi"/>
       <w:color w:themeColor="accent1" w:themeShade="7f" w:val="243F60"/>
     </w:rPr>
   </w:style>
@@ -2222,7 +2260,7 @@
       <w:outlineLvl w:val="5"/>
     </w:pPr>
     <w:rPr>
-      <w:rFonts w:ascii="Calibri" w:hAnsi="Calibri" w:eastAsia="ＭＳ ゴシック" w:cs="" w:asciiTheme="majorHAnsi" w:cstheme="majorBidi" w:eastAsiaTheme="majorEastAsia" w:hAnsiTheme="majorHAnsi"/>
+      <w:rFonts w:ascii="Calibri" w:hAnsi="Calibri" w:eastAsia="" w:cs="" w:asciiTheme="majorHAnsi" w:cstheme="majorBidi" w:eastAsiaTheme="majorEastAsia" w:hAnsiTheme="majorHAnsi"/>
       <w:i/>
       <w:iCs/>
       <w:color w:themeColor="accent1" w:themeShade="7f" w:val="243F60"/>
@@ -2245,7 +2283,7 @@
       <w:outlineLvl w:val="6"/>
     </w:pPr>
     <w:rPr>
-      <w:rFonts w:ascii="Calibri" w:hAnsi="Calibri" w:eastAsia="ＭＳ ゴシック" w:cs="" w:asciiTheme="majorHAnsi" w:cstheme="majorBidi" w:eastAsiaTheme="majorEastAsia" w:hAnsiTheme="majorHAnsi"/>
+      <w:rFonts w:ascii="Calibri" w:hAnsi="Calibri" w:eastAsia="" w:cs="" w:asciiTheme="majorHAnsi" w:cstheme="majorBidi" w:eastAsiaTheme="majorEastAsia" w:hAnsiTheme="majorHAnsi"/>
       <w:i/>
       <w:iCs/>
       <w:color w:themeColor="text1" w:themeTint="bf" w:val="404040"/>
@@ -2268,7 +2306,7 @@
       <w:outlineLvl w:val="7"/>
     </w:pPr>
     <w:rPr>
-      <w:rFonts w:ascii="Calibri" w:hAnsi="Calibri" w:eastAsia="ＭＳ ゴシック" w:cs="" w:asciiTheme="majorHAnsi" w:cstheme="majorBidi" w:eastAsiaTheme="majorEastAsia" w:hAnsiTheme="majorHAnsi"/>
+      <w:rFonts w:ascii="Calibri" w:hAnsi="Calibri" w:eastAsia="" w:cs="" w:asciiTheme="majorHAnsi" w:cstheme="majorBidi" w:eastAsiaTheme="majorEastAsia" w:hAnsiTheme="majorHAnsi"/>
       <w:color w:themeColor="accent1" w:val="4F81BD"/>
       <w:sz w:val="20"/>
       <w:szCs w:val="20"/>
@@ -2291,7 +2329,7 @@
       <w:outlineLvl w:val="8"/>
     </w:pPr>
     <w:rPr>
-      <w:rFonts w:ascii="Calibri" w:hAnsi="Calibri" w:eastAsia="ＭＳ ゴシック" w:cs="" w:asciiTheme="majorHAnsi" w:cstheme="majorBidi" w:eastAsiaTheme="majorEastAsia" w:hAnsiTheme="majorHAnsi"/>
+      <w:rFonts w:ascii="Calibri" w:hAnsi="Calibri" w:eastAsia="" w:cs="" w:asciiTheme="majorHAnsi" w:cstheme="majorBidi" w:eastAsiaTheme="majorEastAsia" w:hAnsiTheme="majorHAnsi"/>
       <w:i/>
       <w:iCs/>
       <w:color w:themeColor="text1" w:themeTint="bf" w:val="404040"/>
@@ -2330,7 +2368,7 @@
     <w:qFormat/>
     <w:rsid w:val="00fc693f"/>
     <w:rPr>
-      <w:rFonts w:ascii="Calibri" w:hAnsi="Calibri" w:eastAsia="ＭＳ ゴシック" w:cs="" w:asciiTheme="majorHAnsi" w:cstheme="majorBidi" w:eastAsiaTheme="majorEastAsia" w:hAnsiTheme="majorHAnsi"/>
+      <w:rFonts w:ascii="Calibri" w:hAnsi="Calibri" w:eastAsia="" w:cs="" w:asciiTheme="majorHAnsi" w:cstheme="majorBidi" w:eastAsiaTheme="majorEastAsia" w:hAnsiTheme="majorHAnsi"/>
       <w:b/>
       <w:bCs/>
       <w:color w:themeColor="accent1" w:themeShade="bf" w:val="365F91"/>
@@ -2345,7 +2383,7 @@
     <w:qFormat/>
     <w:rsid w:val="00fc693f"/>
     <w:rPr>
-      <w:rFonts w:ascii="Calibri" w:hAnsi="Calibri" w:eastAsia="ＭＳ ゴシック" w:cs="" w:asciiTheme="majorHAnsi" w:cstheme="majorBidi" w:eastAsiaTheme="majorEastAsia" w:hAnsiTheme="majorHAnsi"/>
+      <w:rFonts w:ascii="Calibri" w:hAnsi="Calibri" w:eastAsia="" w:cs="" w:asciiTheme="majorHAnsi" w:cstheme="majorBidi" w:eastAsiaTheme="majorEastAsia" w:hAnsiTheme="majorHAnsi"/>
       <w:b/>
       <w:bCs/>
       <w:color w:themeColor="accent1" w:val="4F81BD"/>
@@ -2360,7 +2398,7 @@
     <w:qFormat/>
     <w:rsid w:val="00fc693f"/>
     <w:rPr>
-      <w:rFonts w:ascii="Calibri" w:hAnsi="Calibri" w:eastAsia="ＭＳ ゴシック" w:cs="" w:asciiTheme="majorHAnsi" w:cstheme="majorBidi" w:eastAsiaTheme="majorEastAsia" w:hAnsiTheme="majorHAnsi"/>
+      <w:rFonts w:ascii="Calibri" w:hAnsi="Calibri" w:eastAsia="" w:cs="" w:asciiTheme="majorHAnsi" w:cstheme="majorBidi" w:eastAsiaTheme="majorEastAsia" w:hAnsiTheme="majorHAnsi"/>
       <w:b/>
       <w:bCs/>
       <w:color w:themeColor="accent1" w:val="4F81BD"/>
@@ -2373,7 +2411,7 @@
     <w:qFormat/>
     <w:rsid w:val="00fc693f"/>
     <w:rPr>
-      <w:rFonts w:ascii="Calibri" w:hAnsi="Calibri" w:eastAsia="ＭＳ ゴシック" w:cs="" w:asciiTheme="majorHAnsi" w:cstheme="majorBidi" w:eastAsiaTheme="majorEastAsia" w:hAnsiTheme="majorHAnsi"/>
+      <w:rFonts w:ascii="Calibri" w:hAnsi="Calibri" w:eastAsia="" w:cs="" w:asciiTheme="majorHAnsi" w:cstheme="majorBidi" w:eastAsiaTheme="majorEastAsia" w:hAnsiTheme="majorHAnsi"/>
       <w:color w:themeColor="text2" w:themeShade="bf" w:val="17365D"/>
       <w:spacing w:val="5"/>
       <w:kern w:val="2"/>
@@ -2388,7 +2426,7 @@
     <w:qFormat/>
     <w:rsid w:val="00fc693f"/>
     <w:rPr>
-      <w:rFonts w:ascii="Calibri" w:hAnsi="Calibri" w:eastAsia="ＭＳ ゴシック" w:cs="" w:asciiTheme="majorHAnsi" w:cstheme="majorBidi" w:eastAsiaTheme="majorEastAsia" w:hAnsiTheme="majorHAnsi"/>
+      <w:rFonts w:ascii="Calibri" w:hAnsi="Calibri" w:eastAsia="" w:cs="" w:asciiTheme="majorHAnsi" w:cstheme="majorBidi" w:eastAsiaTheme="majorEastAsia" w:hAnsiTheme="majorHAnsi"/>
       <w:i/>
       <w:iCs/>
       <w:color w:themeColor="accent1" w:val="4F81BD"/>
@@ -2460,7 +2498,7 @@
     <w:qFormat/>
     <w:rsid w:val="00fc693f"/>
     <w:rPr>
-      <w:rFonts w:ascii="Calibri" w:hAnsi="Calibri" w:eastAsia="ＭＳ ゴシック" w:cs="" w:asciiTheme="majorHAnsi" w:cstheme="majorBidi" w:eastAsiaTheme="majorEastAsia" w:hAnsiTheme="majorHAnsi"/>
+      <w:rFonts w:ascii="Calibri" w:hAnsi="Calibri" w:eastAsia="" w:cs="" w:asciiTheme="majorHAnsi" w:cstheme="majorBidi" w:eastAsiaTheme="majorEastAsia" w:hAnsiTheme="majorHAnsi"/>
       <w:b/>
       <w:bCs/>
       <w:i/>
@@ -2476,7 +2514,7 @@
     <w:qFormat/>
     <w:rsid w:val="00fc693f"/>
     <w:rPr>
-      <w:rFonts w:ascii="Calibri" w:hAnsi="Calibri" w:eastAsia="ＭＳ ゴシック" w:cs="" w:asciiTheme="majorHAnsi" w:cstheme="majorBidi" w:eastAsiaTheme="majorEastAsia" w:hAnsiTheme="majorHAnsi"/>
+      <w:rFonts w:ascii="Calibri" w:hAnsi="Calibri" w:eastAsia="" w:cs="" w:asciiTheme="majorHAnsi" w:cstheme="majorBidi" w:eastAsiaTheme="majorEastAsia" w:hAnsiTheme="majorHAnsi"/>
       <w:color w:themeColor="accent1" w:themeShade="7f" w:val="243F60"/>
     </w:rPr>
   </w:style>
@@ -2488,7 +2526,7 @@
     <w:qFormat/>
     <w:rsid w:val="00fc693f"/>
     <w:rPr>
-      <w:rFonts w:ascii="Calibri" w:hAnsi="Calibri" w:eastAsia="ＭＳ ゴシック" w:cs="" w:asciiTheme="majorHAnsi" w:cstheme="majorBidi" w:eastAsiaTheme="majorEastAsia" w:hAnsiTheme="majorHAnsi"/>
+      <w:rFonts w:ascii="Calibri" w:hAnsi="Calibri" w:eastAsia="" w:cs="" w:asciiTheme="majorHAnsi" w:cstheme="majorBidi" w:eastAsiaTheme="majorEastAsia" w:hAnsiTheme="majorHAnsi"/>
       <w:i/>
       <w:iCs/>
       <w:color w:themeColor="accent1" w:themeShade="7f" w:val="243F60"/>
@@ -2502,7 +2540,7 @@
     <w:qFormat/>
     <w:rsid w:val="00fc693f"/>
     <w:rPr>
-      <w:rFonts w:ascii="Calibri" w:hAnsi="Calibri" w:eastAsia="ＭＳ ゴシック" w:cs="" w:asciiTheme="majorHAnsi" w:cstheme="majorBidi" w:eastAsiaTheme="majorEastAsia" w:hAnsiTheme="majorHAnsi"/>
+      <w:rFonts w:ascii="Calibri" w:hAnsi="Calibri" w:eastAsia="" w:cs="" w:asciiTheme="majorHAnsi" w:cstheme="majorBidi" w:eastAsiaTheme="majorEastAsia" w:hAnsiTheme="majorHAnsi"/>
       <w:i/>
       <w:iCs/>
       <w:color w:themeColor="text1" w:themeTint="bf" w:val="404040"/>
@@ -2516,7 +2554,7 @@
     <w:qFormat/>
     <w:rsid w:val="00fc693f"/>
     <w:rPr>
-      <w:rFonts w:ascii="Calibri" w:hAnsi="Calibri" w:eastAsia="ＭＳ ゴシック" w:cs="" w:asciiTheme="majorHAnsi" w:cstheme="majorBidi" w:eastAsiaTheme="majorEastAsia" w:hAnsiTheme="majorHAnsi"/>
+      <w:rFonts w:ascii="Calibri" w:hAnsi="Calibri" w:eastAsia="" w:cs="" w:asciiTheme="majorHAnsi" w:cstheme="majorBidi" w:eastAsiaTheme="majorEastAsia" w:hAnsiTheme="majorHAnsi"/>
       <w:color w:themeColor="accent1" w:val="4F81BD"/>
       <w:sz w:val="20"/>
       <w:szCs w:val="20"/>
@@ -2530,7 +2568,7 @@
     <w:qFormat/>
     <w:rsid w:val="00fc693f"/>
     <w:rPr>
-      <w:rFonts w:ascii="Calibri" w:hAnsi="Calibri" w:eastAsia="ＭＳ ゴシック" w:cs="" w:asciiTheme="majorHAnsi" w:cstheme="majorBidi" w:eastAsiaTheme="majorEastAsia" w:hAnsiTheme="majorHAnsi"/>
+      <w:rFonts w:ascii="Calibri" w:hAnsi="Calibri" w:eastAsia="" w:cs="" w:asciiTheme="majorHAnsi" w:cstheme="majorBidi" w:eastAsiaTheme="majorEastAsia" w:hAnsiTheme="majorHAnsi"/>
       <w:i/>
       <w:iCs/>
       <w:color w:themeColor="text1" w:themeTint="bf" w:val="404040"/>
@@ -2712,6 +2750,39 @@
       <w:rFonts w:cs="Lucida Sans"/>
     </w:rPr>
   </w:style>
+  <w:style w:type="paragraph" w:styleId="Ttulouser">
+    <w:name w:val="Título (user)"/>
+    <w:basedOn w:val="Normal"/>
+    <w:next w:val="BodyText"/>
+    <w:qFormat/>
+    <w:pPr>
+      <w:keepNext w:val="true"/>
+      <w:spacing w:before="240" w:after="120"/>
+    </w:pPr>
+    <w:rPr>
+      <w:rFonts w:ascii="Liberation Sans" w:hAnsi="Liberation Sans" w:eastAsia="Microsoft YaHei" w:cs="Lucida Sans"/>
+      <w:sz w:val="28"/>
+      <w:szCs w:val="28"/>
+    </w:rPr>
+  </w:style>
+  <w:style w:type="paragraph" w:styleId="ndiceuser">
+    <w:name w:val="Índice (user)"/>
+    <w:basedOn w:val="Normal"/>
+    <w:qFormat/>
+    <w:pPr>
+      <w:suppressLineNumbers/>
+    </w:pPr>
+    <w:rPr>
+      <w:rFonts w:cs="Lucida Sans"/>
+    </w:rPr>
+  </w:style>
+  <w:style w:type="paragraph" w:styleId="Cabeceraypieuser">
+    <w:name w:val="Cabecera y pie (user)"/>
+    <w:basedOn w:val="Normal"/>
+    <w:qFormat/>
+    <w:pPr/>
+    <w:rPr/>
+  </w:style>
   <w:style w:type="paragraph" w:styleId="Cabeceraypie">
     <w:name w:val="Cabecera y pie"/>
     <w:basedOn w:val="Normal"/>
@@ -2760,12 +2831,13 @@
     <w:rsid w:val="00fc693f"/>
     <w:pPr>
       <w:widowControl/>
+      <w:suppressAutoHyphens w:val="true"/>
       <w:bidi w:val="0"/>
       <w:spacing w:lineRule="auto" w:line="240" w:before="0" w:after="0"/>
       <w:jc w:val="start"/>
     </w:pPr>
     <w:rPr>
-      <w:rFonts w:ascii="Cambria" w:hAnsi="Cambria" w:eastAsia="ＭＳ 明朝" w:cs="" w:asciiTheme="minorHAnsi" w:cstheme="minorBidi" w:eastAsiaTheme="minorEastAsia" w:hAnsiTheme="minorHAnsi"/>
+      <w:rFonts w:ascii="Cambria" w:hAnsi="Cambria" w:eastAsia="" w:cs="" w:asciiTheme="minorHAnsi" w:cstheme="minorBidi" w:eastAsiaTheme="minorEastAsia" w:hAnsiTheme="minorHAnsi"/>
       <w:color w:val="auto"/>
       <w:kern w:val="0"/>
       <w:sz w:val="22"/>
@@ -2789,7 +2861,7 @@
       <w:contextualSpacing/>
     </w:pPr>
     <w:rPr>
-      <w:rFonts w:ascii="Calibri" w:hAnsi="Calibri" w:eastAsia="ＭＳ ゴシック" w:cs="" w:asciiTheme="majorHAnsi" w:cstheme="majorBidi" w:eastAsiaTheme="majorEastAsia" w:hAnsiTheme="majorHAnsi"/>
+      <w:rFonts w:ascii="Calibri" w:hAnsi="Calibri" w:eastAsia="" w:cs="" w:asciiTheme="majorHAnsi" w:cstheme="majorBidi" w:eastAsiaTheme="majorEastAsia" w:hAnsiTheme="majorHAnsi"/>
       <w:color w:themeColor="text2" w:themeShade="bf" w:val="17365D"/>
       <w:spacing w:val="5"/>
       <w:kern w:val="2"/>
@@ -2807,7 +2879,7 @@
     <w:rsid w:val="00fc693f"/>
     <w:pPr/>
     <w:rPr>
-      <w:rFonts w:ascii="Calibri" w:hAnsi="Calibri" w:eastAsia="ＭＳ ゴシック" w:cs="" w:asciiTheme="majorHAnsi" w:cstheme="majorBidi" w:eastAsiaTheme="majorEastAsia" w:hAnsiTheme="majorHAnsi"/>
+      <w:rFonts w:ascii="Calibri" w:hAnsi="Calibri" w:eastAsia="" w:cs="" w:asciiTheme="majorHAnsi" w:cstheme="majorBidi" w:eastAsiaTheme="majorEastAsia" w:hAnsiTheme="majorHAnsi"/>
       <w:i/>
       <w:iCs/>
       <w:color w:themeColor="accent1" w:val="4F81BD"/>
@@ -3040,12 +3112,13 @@
         <w:tab w:val="left" w:pos="3456" w:leader="none"/>
         <w:tab w:val="left" w:pos="4032" w:leader="none"/>
       </w:tabs>
+      <w:suppressAutoHyphens w:val="true"/>
       <w:bidi w:val="0"/>
       <w:spacing w:lineRule="auto" w:line="276" w:before="0" w:after="200"/>
       <w:jc w:val="start"/>
     </w:pPr>
     <w:rPr>
-      <w:rFonts w:ascii="Courier" w:hAnsi="Courier" w:eastAsia="ＭＳ 明朝" w:cs="" w:cstheme="minorBidi" w:eastAsiaTheme="minorEastAsia"/>
+      <w:rFonts w:ascii="Courier" w:hAnsi="Courier" w:eastAsia="" w:cs="" w:cstheme="minorBidi" w:eastAsiaTheme="minorEastAsia"/>
       <w:color w:val="auto"/>
       <w:kern w:val="0"/>
       <w:sz w:val="20"/>
@@ -3093,7 +3166,7 @@
   </w:style>
   <w:style w:type="paragraph" w:styleId="IndexHeading">
     <w:name w:val="index heading"/>
-    <w:basedOn w:val="Ttulo"/>
+    <w:basedOn w:val="Ttulouser"/>
     <w:pPr/>
     <w:rPr/>
   </w:style>
@@ -3117,6 +3190,7 @@
     <w:pPr>
       <w:keepNext w:val="true"/>
       <w:widowControl/>
+      <w:suppressAutoHyphens w:val="true"/>
       <w:bidi w:val="0"/>
       <w:spacing w:lineRule="auto" w:line="276" w:before="160" w:after="40"/>
       <w:jc w:val="start"/>
@@ -3137,6 +3211,7 @@
     <w:pPr>
       <w:keepNext w:val="true"/>
       <w:widowControl/>
+      <w:suppressAutoHyphens w:val="true"/>
       <w:bidi w:val="0"/>
       <w:spacing w:lineRule="auto" w:line="276" w:before="0" w:after="80"/>
       <w:jc w:val="start"/>
@@ -3151,8 +3226,8 @@
       <w:lang w:val="en-US" w:eastAsia="en-US" w:bidi="ar-SA"/>
     </w:rPr>
   </w:style>
-  <w:style w:type="numbering" w:styleId="Ningunalista" w:default="1">
-    <w:name w:val="Ninguna lista"/>
+  <w:style w:type="numbering" w:styleId="Ningunalistauser" w:default="1">
+    <w:name w:val="Ninguna lista (user)"/>
     <w:uiPriority w:val="99"/>
     <w:semiHidden/>
     <w:unhideWhenUsed/>
@@ -6283,7 +6358,6 @@
       <w:pPr>
         <w:spacing w:before="0" w:after="0" w:line="240" w:lineRule="auto"/>
       </w:pPr>
-      <w:rPr/>
       <w:tblPr/>
       <w:tcPr>
         <w:tcBorders>
@@ -6429,7 +6503,6 @@
       <w:pPr>
         <w:spacing w:before="0" w:after="0" w:line="240" w:lineRule="auto"/>
       </w:pPr>
-      <w:rPr/>
       <w:tblPr/>
       <w:tcPr>
         <w:tcBorders>
@@ -6575,7 +6648,6 @@
       <w:pPr>
         <w:spacing w:before="0" w:after="0" w:line="240" w:lineRule="auto"/>
       </w:pPr>
-      <w:rPr/>
       <w:tblPr/>
       <w:tcPr>
         <w:tcBorders>
@@ -6721,7 +6793,6 @@
       <w:pPr>
         <w:spacing w:before="0" w:after="0" w:line="240" w:lineRule="auto"/>
       </w:pPr>
-      <w:rPr/>
       <w:tblPr/>
       <w:tcPr>
         <w:tcBorders>
@@ -6867,7 +6938,6 @@
       <w:pPr>
         <w:spacing w:before="0" w:after="0" w:line="240" w:lineRule="auto"/>
       </w:pPr>
-      <w:rPr/>
       <w:tblPr/>
       <w:tcPr>
         <w:tcBorders>
@@ -7013,7 +7083,6 @@
       <w:pPr>
         <w:spacing w:before="0" w:after="0" w:line="240" w:lineRule="auto"/>
       </w:pPr>
-      <w:rPr/>
       <w:tblPr/>
       <w:tcPr>
         <w:tcBorders>
@@ -7159,7 +7228,6 @@
       <w:pPr>
         <w:spacing w:before="0" w:after="0" w:line="240" w:lineRule="auto"/>
       </w:pPr>
-      <w:rPr/>
       <w:tblPr/>
       <w:tcPr>
         <w:tcBorders>

</xml_diff>